<commit_message>
fix(submission): EER package corrections per the live Guide for Authors
Update author affiliation to Graduate School of Business, Nazarbayev
University with the full building-level postal address (53 Kabanbay
Batyr Ave, Building C3), per the user's clarification.

Rebuild the EER package's manuscript component as a verified-standalone
LaTeX source bundle (corridor.tex + corridor.bib + 5 figures, local
graphicspath) rather than PDF-only: EER's actual Guide for Authors,
supplied directly by the user after automated fetches were blocked,
states plainly that "a PDF is not an acceptable source file," unlike
JIE/INTECO/JCE's PDF-at-new-submission policy. Also rewrote
SUBMISSION_CHECKLIST.md against the real guide (single-anonymized
review confirmed, EUR 125/100 submission fee flagged as a payment
action only the user can complete, special-issue fee-waiver option
noted, full compliance table).

Co-Authored-By: Claude Sonnet 5 <noreply@anthropic.com>
</commit_message>
<xml_diff>
--- a/submission_eer_special_issue/cover_letter.docx
+++ b/submission_eer_special_issue/cover_letter.docx
@@ -9,12 +9,12 @@
     </w:p>
     <w:p>
       <w:r>
-        <w:t xml:space="preserve">Nazarbayev University</w:t>
-      </w:r>
-    </w:p>
-    <w:p>
-      <w:r>
-        <w:t xml:space="preserve">53 Kabanbay Batyr Ave, Astana 010000, Kazakhstan</w:t>
+        <w:t xml:space="preserve">Graduate School of Business, Nazarbayev University</w:t>
+      </w:r>
+    </w:p>
+    <w:p>
+      <w:r>
+        <w:t xml:space="preserve">53 Kabanbay Batyr Ave, Building C3, Astana 010000, Kazakhstan</w:t>
       </w:r>
     </w:p>
     <w:p>

</xml_diff>

<commit_message>
fix(submission): neutral framing and narrowed claims in the blind Word manuscript
Edit the Word manuscript directly: remove sanctions wording, state the regulatory constraint as an entry-cost wedge, narrow the investment-null and institutions claims, correct the matched-window flow-through, placebo label and deal-ID statement, condense the policy section to conjecture, withhold the DOI, and add sample-construction notes and four references. Clean review-process wording from the replication package and code comments.

Co-Authored-By: Claude Sonnet 5.5 <noreply@anthropic.com>
</commit_message>
<xml_diff>
--- a/submission_eer_special_issue/cover_letter.docx
+++ b/submission_eer_special_issue/cover_letter.docx
@@ -554,15 +554,15 @@
       </w:r>
       <w:proofErr w:type="spellStart"/>
       <w:r>
-        <w:t>paper</w:t>
-      </w:r>
-      <w:proofErr w:type="spellEnd"/>
-      <w:r>
-        <w:t xml:space="preserve"> </w:t>
-      </w:r>
-      <w:proofErr w:type="spellStart"/>
-      <w:r>
-        <w:t>studies</w:t>
+        <w:t xml:space="preserve">paper</w:t>
+      </w:r>
+      <w:proofErr w:type="spellEnd"/>
+      <w:r>
+        <w:t xml:space="preserve"> </w:t>
+      </w:r>
+      <w:proofErr w:type="spellStart"/>
+      <w:r>
+        <w:t xml:space="preserve">studies</w:t>
       </w:r>
       <w:proofErr w:type="spellEnd"/>
       <w:r>
@@ -570,71 +570,71 @@
       </w:r>
       <w:proofErr w:type="spellStart"/>
       <w:r>
-        <w:t>case</w:t>
-      </w:r>
-      <w:proofErr w:type="spellEnd"/>
-      <w:r>
-        <w:t xml:space="preserve"> </w:t>
-      </w:r>
-      <w:proofErr w:type="spellStart"/>
-      <w:r>
-        <w:t>at</w:t>
-      </w:r>
-      <w:proofErr w:type="spellEnd"/>
-      <w:r>
-        <w:t xml:space="preserve"> </w:t>
-      </w:r>
-      <w:proofErr w:type="spellStart"/>
-      <w:r>
-        <w:t>the</w:t>
-      </w:r>
-      <w:proofErr w:type="spellEnd"/>
-      <w:r>
-        <w:t xml:space="preserve"> </w:t>
-      </w:r>
-      <w:proofErr w:type="spellStart"/>
-      <w:r>
-        <w:t>center</w:t>
-      </w:r>
-      <w:proofErr w:type="spellEnd"/>
-      <w:r>
-        <w:t xml:space="preserve"> </w:t>
-      </w:r>
-      <w:proofErr w:type="spellStart"/>
-      <w:r>
-        <w:t>of</w:t>
-      </w:r>
-      <w:proofErr w:type="spellEnd"/>
-      <w:r>
-        <w:t xml:space="preserve"> </w:t>
-      </w:r>
-      <w:proofErr w:type="spellStart"/>
-      <w:r>
-        <w:t>the</w:t>
-      </w:r>
-      <w:proofErr w:type="spellEnd"/>
-      <w:r>
-        <w:t xml:space="preserve"> </w:t>
-      </w:r>
-      <w:proofErr w:type="spellStart"/>
-      <w:r>
-        <w:t>special</w:t>
-      </w:r>
-      <w:proofErr w:type="spellEnd"/>
-      <w:r>
-        <w:t xml:space="preserve"> </w:t>
-      </w:r>
-      <w:proofErr w:type="spellStart"/>
-      <w:r>
-        <w:t>issue's</w:t>
-      </w:r>
-      <w:proofErr w:type="spellEnd"/>
-      <w:r>
-        <w:t xml:space="preserve"> </w:t>
-      </w:r>
-      <w:proofErr w:type="spellStart"/>
-      <w:r>
-        <w:t>call</w:t>
+        <w:t xml:space="preserve">case</w:t>
+      </w:r>
+      <w:proofErr w:type="spellEnd"/>
+      <w:r>
+        <w:t xml:space="preserve"> </w:t>
+      </w:r>
+      <w:proofErr w:type="spellStart"/>
+      <w:r>
+        <w:t xml:space="preserve">at</w:t>
+      </w:r>
+      <w:proofErr w:type="spellEnd"/>
+      <w:r>
+        <w:t xml:space="preserve"> </w:t>
+      </w:r>
+      <w:proofErr w:type="spellStart"/>
+      <w:r>
+        <w:t xml:space="preserve">the</w:t>
+      </w:r>
+      <w:proofErr w:type="spellEnd"/>
+      <w:r>
+        <w:t xml:space="preserve"> </w:t>
+      </w:r>
+      <w:proofErr w:type="spellStart"/>
+      <w:r>
+        <w:t xml:space="preserve">center</w:t>
+      </w:r>
+      <w:proofErr w:type="spellEnd"/>
+      <w:r>
+        <w:t xml:space="preserve"> </w:t>
+      </w:r>
+      <w:proofErr w:type="spellStart"/>
+      <w:r>
+        <w:t xml:space="preserve">of</w:t>
+      </w:r>
+      <w:proofErr w:type="spellEnd"/>
+      <w:r>
+        <w:t xml:space="preserve"> </w:t>
+      </w:r>
+      <w:proofErr w:type="spellStart"/>
+      <w:r>
+        <w:t xml:space="preserve">the</w:t>
+      </w:r>
+      <w:proofErr w:type="spellEnd"/>
+      <w:r>
+        <w:t xml:space="preserve"> </w:t>
+      </w:r>
+      <w:proofErr w:type="spellStart"/>
+      <w:r>
+        <w:t xml:space="preserve">special</w:t>
+      </w:r>
+      <w:proofErr w:type="spellEnd"/>
+      <w:r>
+        <w:t xml:space="preserve"> </w:t>
+      </w:r>
+      <w:proofErr w:type="spellStart"/>
+      <w:r>
+        <w:t xml:space="preserve">issue's</w:t>
+      </w:r>
+      <w:proofErr w:type="spellEnd"/>
+      <w:r>
+        <w:t xml:space="preserve"> </w:t>
+      </w:r>
+      <w:proofErr w:type="spellStart"/>
+      <w:r>
+        <w:t xml:space="preserve">call</w:t>
       </w:r>
       <w:proofErr w:type="spellEnd"/>
       <w:r>
@@ -642,15 +642,15 @@
       </w:r>
       <w:proofErr w:type="spellStart"/>
       <w:r>
-        <w:t>after</w:t>
-      </w:r>
-      <w:proofErr w:type="spellEnd"/>
-      <w:r>
-        <w:t xml:space="preserve"> </w:t>
-      </w:r>
-      <w:proofErr w:type="spellStart"/>
-      <w:r>
-        <w:t>February</w:t>
+        <w:t xml:space="preserve">after</w:t>
+      </w:r>
+      <w:proofErr w:type="spellEnd"/>
+      <w:r>
+        <w:t xml:space="preserve"> </w:t>
+      </w:r>
+      <w:proofErr w:type="spellStart"/>
+      <w:r>
+        <w:t xml:space="preserve">February</w:t>
       </w:r>
       <w:proofErr w:type="spellEnd"/>
       <w:r>
@@ -658,7 +658,7 @@
       </w:r>
       <w:proofErr w:type="spellStart"/>
       <w:r>
-        <w:t>large</w:t>
+        <w:t xml:space="preserve">large</w:t>
       </w:r>
       <w:proofErr w:type="spellEnd"/>
       <w:r>
@@ -666,87 +666,87 @@
       </w:r>
       <w:proofErr w:type="spellStart"/>
       <w:r>
-        <w:t>sector-specific</w:t>
-      </w:r>
-      <w:proofErr w:type="spellEnd"/>
-      <w:r>
-        <w:t xml:space="preserve"> </w:t>
-      </w:r>
-      <w:proofErr w:type="spellStart"/>
-      <w:r>
-        <w:t>share</w:t>
-      </w:r>
-      <w:proofErr w:type="spellEnd"/>
-      <w:r>
-        <w:t xml:space="preserve"> </w:t>
-      </w:r>
-      <w:proofErr w:type="spellStart"/>
-      <w:r>
-        <w:t>of</w:t>
-      </w:r>
-      <w:proofErr w:type="spellEnd"/>
-      <w:r>
-        <w:t xml:space="preserve"> </w:t>
-      </w:r>
-      <w:proofErr w:type="spellStart"/>
-      <w:r>
-        <w:t>Russia's</w:t>
-      </w:r>
-      <w:proofErr w:type="spellEnd"/>
-      <w:r>
-        <w:t xml:space="preserve"> </w:t>
-      </w:r>
-      <w:proofErr w:type="spellStart"/>
-      <w:r>
-        <w:t>disrupted</w:t>
-      </w:r>
-      <w:proofErr w:type="spellEnd"/>
-      <w:r>
-        <w:t xml:space="preserve"> </w:t>
-      </w:r>
-      <w:proofErr w:type="spellStart"/>
-      <w:r>
-        <w:t>trade</w:t>
-      </w:r>
-      <w:proofErr w:type="spellEnd"/>
-      <w:r>
-        <w:t xml:space="preserve"> </w:t>
-      </w:r>
-      <w:proofErr w:type="spellStart"/>
-      <w:r>
-        <w:t>was</w:t>
-      </w:r>
-      <w:proofErr w:type="spellEnd"/>
-      <w:r>
-        <w:t xml:space="preserve"> </w:t>
-      </w:r>
-      <w:proofErr w:type="spellStart"/>
-      <w:r>
-        <w:t>reallocated</w:t>
-      </w:r>
-      <w:proofErr w:type="spellEnd"/>
-      <w:r>
-        <w:t xml:space="preserve"> </w:t>
-      </w:r>
-      <w:proofErr w:type="spellStart"/>
-      <w:r>
-        <w:t>through</w:t>
-      </w:r>
-      <w:proofErr w:type="spellEnd"/>
-      <w:r>
-        <w:t xml:space="preserve"> </w:t>
-      </w:r>
-      <w:proofErr w:type="spellStart"/>
-      <w:r>
-        <w:t>neighbouring</w:t>
-      </w:r>
-      <w:proofErr w:type="spellEnd"/>
-      <w:r>
-        <w:t xml:space="preserve"> </w:t>
-      </w:r>
-      <w:proofErr w:type="spellStart"/>
-      <w:r>
-        <w:t>economies</w:t>
+        <w:t xml:space="preserve">sector-specific</w:t>
+      </w:r>
+      <w:proofErr w:type="spellEnd"/>
+      <w:r>
+        <w:t xml:space="preserve"> </w:t>
+      </w:r>
+      <w:proofErr w:type="spellStart"/>
+      <w:r>
+        <w:t xml:space="preserve">share</w:t>
+      </w:r>
+      <w:proofErr w:type="spellEnd"/>
+      <w:r>
+        <w:t xml:space="preserve"> </w:t>
+      </w:r>
+      <w:proofErr w:type="spellStart"/>
+      <w:r>
+        <w:t xml:space="preserve">of</w:t>
+      </w:r>
+      <w:proofErr w:type="spellEnd"/>
+      <w:r>
+        <w:t xml:space="preserve"> </w:t>
+      </w:r>
+      <w:proofErr w:type="spellStart"/>
+      <w:r>
+        <w:t xml:space="preserve">Russia's</w:t>
+      </w:r>
+      <w:proofErr w:type="spellEnd"/>
+      <w:r>
+        <w:t xml:space="preserve"> </w:t>
+      </w:r>
+      <w:proofErr w:type="spellStart"/>
+      <w:r>
+        <w:t xml:space="preserve">disrupted</w:t>
+      </w:r>
+      <w:proofErr w:type="spellEnd"/>
+      <w:r>
+        <w:t xml:space="preserve"> </w:t>
+      </w:r>
+      <w:proofErr w:type="spellStart"/>
+      <w:r>
+        <w:t xml:space="preserve">trade</w:t>
+      </w:r>
+      <w:proofErr w:type="spellEnd"/>
+      <w:r>
+        <w:t xml:space="preserve"> </w:t>
+      </w:r>
+      <w:proofErr w:type="spellStart"/>
+      <w:r>
+        <w:t xml:space="preserve">was</w:t>
+      </w:r>
+      <w:proofErr w:type="spellEnd"/>
+      <w:r>
+        <w:t xml:space="preserve"> </w:t>
+      </w:r>
+      <w:proofErr w:type="spellStart"/>
+      <w:r>
+        <w:t xml:space="preserve">reallocated</w:t>
+      </w:r>
+      <w:proofErr w:type="spellEnd"/>
+      <w:r>
+        <w:t xml:space="preserve"> </w:t>
+      </w:r>
+      <w:proofErr w:type="spellStart"/>
+      <w:r>
+        <w:t xml:space="preserve">through</w:t>
+      </w:r>
+      <w:proofErr w:type="spellEnd"/>
+      <w:r>
+        <w:t xml:space="preserve"> </w:t>
+      </w:r>
+      <w:proofErr w:type="spellStart"/>
+      <w:r>
+        <w:t xml:space="preserve">neighbouring</w:t>
+      </w:r>
+      <w:proofErr w:type="spellEnd"/>
+      <w:r>
+        <w:t xml:space="preserve"> </w:t>
+      </w:r>
+      <w:proofErr w:type="spellStart"/>
+      <w:r>
+        <w:t xml:space="preserve">economies</w:t>
       </w:r>
       <w:proofErr w:type="spellEnd"/>
       <w:r>
@@ -754,15 +754,15 @@
       </w:r>
       <w:proofErr w:type="spellStart"/>
       <w:r>
-        <w:t>among</w:t>
-      </w:r>
-      <w:proofErr w:type="spellEnd"/>
-      <w:r>
-        <w:t xml:space="preserve"> </w:t>
-      </w:r>
-      <w:proofErr w:type="spellStart"/>
-      <w:r>
-        <w:t>them</w:t>
+        <w:t xml:space="preserve">among</w:t>
+      </w:r>
+      <w:proofErr w:type="spellEnd"/>
+      <w:r>
+        <w:t xml:space="preserve"> </w:t>
+      </w:r>
+      <w:proofErr w:type="spellStart"/>
+      <w:r>
+        <w:t xml:space="preserve">them</w:t>
       </w:r>
       <w:proofErr w:type="spellEnd"/>
       <w:r>
@@ -770,23 +770,23 @@
       </w:r>
       <w:proofErr w:type="spellStart"/>
       <w:r>
-        <w:t>measure</w:t>
-      </w:r>
-      <w:proofErr w:type="spellEnd"/>
-      <w:r>
-        <w:t xml:space="preserve"> </w:t>
-      </w:r>
-      <w:proofErr w:type="spellStart"/>
-      <w:r>
-        <w:t>the</w:t>
-      </w:r>
-      <w:proofErr w:type="spellEnd"/>
-      <w:r>
-        <w:t xml:space="preserve"> </w:t>
-      </w:r>
-      <w:proofErr w:type="spellStart"/>
-      <w:r>
-        <w:t>shock</w:t>
+        <w:t xml:space="preserve">measure</w:t>
+      </w:r>
+      <w:proofErr w:type="spellEnd"/>
+      <w:r>
+        <w:t xml:space="preserve"> </w:t>
+      </w:r>
+      <w:proofErr w:type="spellStart"/>
+      <w:r>
+        <w:t xml:space="preserve">the</w:t>
+      </w:r>
+      <w:proofErr w:type="spellEnd"/>
+      <w:r>
+        <w:t xml:space="preserve"> </w:t>
+      </w:r>
+      <w:proofErr w:type="spellStart"/>
+      <w:r>
+        <w:t xml:space="preserve">shock</w:t>
       </w:r>
       <w:proofErr w:type="spellEnd"/>
       <w:r>
@@ -794,63 +794,63 @@
       </w:r>
       <w:proofErr w:type="spellStart"/>
       <w:r>
-        <w:t>estimate</w:t>
-      </w:r>
-      <w:proofErr w:type="spellEnd"/>
-      <w:r>
-        <w:t xml:space="preserve"> </w:t>
-      </w:r>
-      <w:proofErr w:type="spellStart"/>
-      <w:r>
-        <w:t>what</w:t>
-      </w:r>
-      <w:proofErr w:type="spellEnd"/>
-      <w:r>
-        <w:t xml:space="preserve"> </w:t>
-      </w:r>
-      <w:proofErr w:type="spellStart"/>
-      <w:r>
-        <w:t>the</w:t>
-      </w:r>
-      <w:proofErr w:type="spellEnd"/>
-      <w:r>
-        <w:t xml:space="preserve"> </w:t>
-      </w:r>
-      <w:proofErr w:type="spellStart"/>
-      <w:r>
-        <w:t>host</w:t>
-      </w:r>
-      <w:proofErr w:type="spellEnd"/>
-      <w:r>
-        <w:t xml:space="preserve"> </w:t>
-      </w:r>
-      <w:proofErr w:type="spellStart"/>
-      <w:r>
-        <w:t>economy</w:t>
-      </w:r>
-      <w:proofErr w:type="spellEnd"/>
-      <w:r>
-        <w:t xml:space="preserve"> </w:t>
-      </w:r>
-      <w:proofErr w:type="spellStart"/>
-      <w:r>
-        <w:t>retains</w:t>
-      </w:r>
-      <w:proofErr w:type="spellEnd"/>
-      <w:r>
-        <w:t xml:space="preserve"> </w:t>
-      </w:r>
-      <w:proofErr w:type="spellStart"/>
-      <w:r>
-        <w:t>from</w:t>
-      </w:r>
-      <w:proofErr w:type="spellEnd"/>
-      <w:r>
-        <w:t xml:space="preserve"> </w:t>
-      </w:r>
-      <w:proofErr w:type="spellStart"/>
-      <w:r>
-        <w:t>it</w:t>
+        <w:t xml:space="preserve">estimate</w:t>
+      </w:r>
+      <w:proofErr w:type="spellEnd"/>
+      <w:r>
+        <w:t xml:space="preserve"> </w:t>
+      </w:r>
+      <w:proofErr w:type="spellStart"/>
+      <w:r>
+        <w:t xml:space="preserve">what</w:t>
+      </w:r>
+      <w:proofErr w:type="spellEnd"/>
+      <w:r>
+        <w:t xml:space="preserve"> </w:t>
+      </w:r>
+      <w:proofErr w:type="spellStart"/>
+      <w:r>
+        <w:t xml:space="preserve">the</w:t>
+      </w:r>
+      <w:proofErr w:type="spellEnd"/>
+      <w:r>
+        <w:t xml:space="preserve"> </w:t>
+      </w:r>
+      <w:proofErr w:type="spellStart"/>
+      <w:r>
+        <w:t xml:space="preserve">host</w:t>
+      </w:r>
+      <w:proofErr w:type="spellEnd"/>
+      <w:r>
+        <w:t xml:space="preserve"> </w:t>
+      </w:r>
+      <w:proofErr w:type="spellStart"/>
+      <w:r>
+        <w:t xml:space="preserve">economy</w:t>
+      </w:r>
+      <w:proofErr w:type="spellEnd"/>
+      <w:r>
+        <w:t xml:space="preserve"> </w:t>
+      </w:r>
+      <w:proofErr w:type="spellStart"/>
+      <w:r>
+        <w:t xml:space="preserve">retains</w:t>
+      </w:r>
+      <w:proofErr w:type="spellEnd"/>
+      <w:r>
+        <w:t xml:space="preserve"> </w:t>
+      </w:r>
+      <w:proofErr w:type="spellStart"/>
+      <w:r>
+        <w:t xml:space="preserve">from</w:t>
+      </w:r>
+      <w:proofErr w:type="spellEnd"/>
+      <w:r>
+        <w:t xml:space="preserve"> </w:t>
+      </w:r>
+      <w:proofErr w:type="spellStart"/>
+      <w:r>
+        <w:t xml:space="preserve">it</w:t>
       </w:r>
       <w:proofErr w:type="spellEnd"/>
       <w:r>
@@ -858,55 +858,55 @@
       </w:r>
       <w:proofErr w:type="spellStart"/>
       <w:r>
-        <w:t>and</w:t>
-      </w:r>
-      <w:proofErr w:type="spellEnd"/>
-      <w:r>
-        <w:t xml:space="preserve"> </w:t>
-      </w:r>
-      <w:proofErr w:type="spellStart"/>
-      <w:r>
-        <w:t>ask</w:t>
-      </w:r>
-      <w:proofErr w:type="spellEnd"/>
-      <w:r>
-        <w:t xml:space="preserve"> </w:t>
-      </w:r>
-      <w:proofErr w:type="spellStart"/>
-      <w:r>
-        <w:t>whether</w:t>
-      </w:r>
-      <w:proofErr w:type="spellEnd"/>
-      <w:r>
-        <w:t xml:space="preserve"> </w:t>
-      </w:r>
-      <w:proofErr w:type="spellStart"/>
-      <w:r>
-        <w:t>it</w:t>
-      </w:r>
-      <w:proofErr w:type="spellEnd"/>
-      <w:r>
-        <w:t xml:space="preserve"> </w:t>
-      </w:r>
-      <w:proofErr w:type="spellStart"/>
-      <w:r>
-        <w:t>induced</w:t>
-      </w:r>
-      <w:proofErr w:type="spellEnd"/>
-      <w:r>
-        <w:t xml:space="preserve"> </w:t>
-      </w:r>
-      <w:proofErr w:type="spellStart"/>
-      <w:r>
-        <w:t>domestic</w:t>
-      </w:r>
-      <w:proofErr w:type="spellEnd"/>
-      <w:r>
-        <w:t xml:space="preserve"> </w:t>
-      </w:r>
-      <w:proofErr w:type="spellStart"/>
-      <w:r>
-        <w:t>investment</w:t>
+        <w:t xml:space="preserve">and</w:t>
+      </w:r>
+      <w:proofErr w:type="spellEnd"/>
+      <w:r>
+        <w:t xml:space="preserve"> </w:t>
+      </w:r>
+      <w:proofErr w:type="spellStart"/>
+      <w:r>
+        <w:t xml:space="preserve">ask</w:t>
+      </w:r>
+      <w:proofErr w:type="spellEnd"/>
+      <w:r>
+        <w:t xml:space="preserve"> </w:t>
+      </w:r>
+      <w:proofErr w:type="spellStart"/>
+      <w:r>
+        <w:t xml:space="preserve">whether</w:t>
+      </w:r>
+      <w:proofErr w:type="spellEnd"/>
+      <w:r>
+        <w:t xml:space="preserve"> </w:t>
+      </w:r>
+      <w:proofErr w:type="spellStart"/>
+      <w:r>
+        <w:t xml:space="preserve">it</w:t>
+      </w:r>
+      <w:proofErr w:type="spellEnd"/>
+      <w:r>
+        <w:t xml:space="preserve"> </w:t>
+      </w:r>
+      <w:proofErr w:type="spellStart"/>
+      <w:r>
+        <w:t xml:space="preserve">induced</w:t>
+      </w:r>
+      <w:proofErr w:type="spellEnd"/>
+      <w:r>
+        <w:t xml:space="preserve"> </w:t>
+      </w:r>
+      <w:proofErr w:type="spellStart"/>
+      <w:r>
+        <w:t xml:space="preserve">domestic</w:t>
+      </w:r>
+      <w:proofErr w:type="spellEnd"/>
+      <w:r>
+        <w:t xml:space="preserve"> </w:t>
+      </w:r>
+      <w:proofErr w:type="spellStart"/>
+      <w:r>
+        <w:t xml:space="preserve">investment</w:t>
       </w:r>
       <w:proofErr w:type="spellEnd"/>
       <w:r>
@@ -914,71 +914,71 @@
       </w:r>
       <w:proofErr w:type="spellStart"/>
       <w:r>
-        <w:t>finding</w:t>
-      </w:r>
-      <w:proofErr w:type="spellEnd"/>
-      <w:r>
-        <w:t xml:space="preserve"> </w:t>
-      </w:r>
-      <w:proofErr w:type="spellStart"/>
-      <w:r>
-        <w:t>that</w:t>
-      </w:r>
-      <w:proofErr w:type="spellEnd"/>
-      <w:r>
-        <w:t xml:space="preserve"> </w:t>
-      </w:r>
-      <w:proofErr w:type="spellStart"/>
-      <w:r>
-        <w:t>it</w:t>
-      </w:r>
-      <w:proofErr w:type="spellEnd"/>
-      <w:r>
-        <w:t xml:space="preserve"> </w:t>
-      </w:r>
-      <w:proofErr w:type="spellStart"/>
-      <w:r>
-        <w:t>did</w:t>
-      </w:r>
-      <w:proofErr w:type="spellEnd"/>
-      <w:r>
-        <w:t xml:space="preserve"> </w:t>
-      </w:r>
-      <w:proofErr w:type="spellStart"/>
-      <w:r>
-        <w:t>not</w:t>
-      </w:r>
-      <w:proofErr w:type="spellEnd"/>
-      <w:r>
-        <w:t xml:space="preserve">. We </w:t>
-      </w:r>
-      <w:proofErr w:type="spellStart"/>
-      <w:r>
-        <w:t>read</w:t>
-      </w:r>
-      <w:proofErr w:type="spellEnd"/>
-      <w:r>
-        <w:t xml:space="preserve"> </w:t>
-      </w:r>
-      <w:proofErr w:type="spellStart"/>
-      <w:r>
-        <w:t>that</w:t>
-      </w:r>
-      <w:proofErr w:type="spellEnd"/>
-      <w:r>
-        <w:t xml:space="preserve"> </w:t>
-      </w:r>
-      <w:proofErr w:type="spellStart"/>
-      <w:r>
-        <w:t>null</w:t>
-      </w:r>
-      <w:proofErr w:type="spellEnd"/>
-      <w:r>
-        <w:t xml:space="preserve"> </w:t>
-      </w:r>
-      <w:proofErr w:type="spellStart"/>
-      <w:r>
-        <w:t>through</w:t>
+        <w:t xml:space="preserve">finding no detectable change in deal-making.</w:t>
+      </w:r>
+      <w:proofErr w:type="spellEnd"/>
+      <w:r>
+        <w:t xml:space="preserve"/>
+      </w:r>
+      <w:proofErr w:type="spellStart"/>
+      <w:r>
+        <w:t xml:space="preserve"/>
+      </w:r>
+      <w:proofErr w:type="spellEnd"/>
+      <w:r>
+        <w:t xml:space="preserve"/>
+      </w:r>
+      <w:proofErr w:type="spellStart"/>
+      <w:r>
+        <w:t xml:space="preserve"/>
+      </w:r>
+      <w:proofErr w:type="spellEnd"/>
+      <w:r>
+        <w:t xml:space="preserve"/>
+      </w:r>
+      <w:proofErr w:type="spellStart"/>
+      <w:r>
+        <w:t xml:space="preserve"/>
+      </w:r>
+      <w:proofErr w:type="spellEnd"/>
+      <w:r>
+        <w:t xml:space="preserve"/>
+      </w:r>
+      <w:proofErr w:type="spellStart"/>
+      <w:r>
+        <w:t xml:space="preserve"/>
+      </w:r>
+      <w:proofErr w:type="spellEnd"/>
+      <w:r>
+        <w:t xml:space="preserve"> We </w:t>
+      </w:r>
+      <w:proofErr w:type="spellStart"/>
+      <w:r>
+        <w:t xml:space="preserve">read</w:t>
+      </w:r>
+      <w:proofErr w:type="spellEnd"/>
+      <w:r>
+        <w:t xml:space="preserve"> </w:t>
+      </w:r>
+      <w:proofErr w:type="spellStart"/>
+      <w:r>
+        <w:t xml:space="preserve">that</w:t>
+      </w:r>
+      <w:proofErr w:type="spellEnd"/>
+      <w:r>
+        <w:t xml:space="preserve"> </w:t>
+      </w:r>
+      <w:proofErr w:type="spellStart"/>
+      <w:r>
+        <w:t xml:space="preserve">null</w:t>
+      </w:r>
+      <w:proofErr w:type="spellEnd"/>
+      <w:r>
+        <w:t xml:space="preserve"> </w:t>
+      </w:r>
+      <w:proofErr w:type="spellStart"/>
+      <w:r>
+        <w:t xml:space="preserve">through</w:t>
       </w:r>
       <w:proofErr w:type="spellEnd"/>
       <w:r>
@@ -986,15 +986,15 @@
       </w:r>
       <w:proofErr w:type="spellStart"/>
       <w:r>
-        <w:t>three-gate</w:t>
-      </w:r>
-      <w:proofErr w:type="spellEnd"/>
-      <w:r>
-        <w:t xml:space="preserve"> </w:t>
-      </w:r>
-      <w:proofErr w:type="spellStart"/>
-      <w:r>
-        <w:t>framework</w:t>
+        <w:t xml:space="preserve">three-gate</w:t>
+      </w:r>
+      <w:proofErr w:type="spellEnd"/>
+      <w:r>
+        <w:t xml:space="preserve"> </w:t>
+      </w:r>
+      <w:proofErr w:type="spellStart"/>
+      <w:r>
+        <w:t xml:space="preserve">framework</w:t>
       </w:r>
       <w:proofErr w:type="spellEnd"/>
       <w:r>
@@ -1002,15 +1002,15 @@
       </w:r>
       <w:proofErr w:type="spellStart"/>
       <w:r>
-        <w:t>market</w:t>
-      </w:r>
-      <w:proofErr w:type="spellEnd"/>
-      <w:r>
-        <w:t xml:space="preserve"> </w:t>
-      </w:r>
-      <w:proofErr w:type="spellStart"/>
-      <w:r>
-        <w:t>access</w:t>
+        <w:t xml:space="preserve">market</w:t>
+      </w:r>
+      <w:proofErr w:type="spellEnd"/>
+      <w:r>
+        <w:t xml:space="preserve"> </w:t>
+      </w:r>
+      <w:proofErr w:type="spellStart"/>
+      <w:r>
+        <w:t xml:space="preserve">access</w:t>
       </w:r>
       <w:proofErr w:type="spellEnd"/>
       <w:r>
@@ -1018,7 +1018,7 @@
       </w:r>
       <w:proofErr w:type="spellStart"/>
       <w:r>
-        <w:t>irreversibility</w:t>
+        <w:t xml:space="preserve">irreversibility</w:t>
       </w:r>
       <w:proofErr w:type="spellEnd"/>
       <w:r>
@@ -1026,15 +1026,15 @@
       </w:r>
       <w:proofErr w:type="spellStart"/>
       <w:r>
-        <w:t>capital-market</w:t>
-      </w:r>
-      <w:proofErr w:type="spellEnd"/>
-      <w:r>
-        <w:t xml:space="preserve"> </w:t>
-      </w:r>
-      <w:proofErr w:type="spellStart"/>
-      <w:r>
-        <w:t>institutions</w:t>
+        <w:t xml:space="preserve">capital-market</w:t>
+      </w:r>
+      <w:proofErr w:type="spellEnd"/>
+      <w:r>
+        <w:t xml:space="preserve"> </w:t>
+      </w:r>
+      <w:proofErr w:type="spellStart"/>
+      <w:r>
+        <w:t xml:space="preserve">institutions</w:t>
       </w:r>
       <w:proofErr w:type="spellEnd"/>
       <w:r>
@@ -1042,15 +1042,15 @@
       </w:r>
       <w:proofErr w:type="spellStart"/>
       <w:r>
-        <w:t>in</w:t>
-      </w:r>
-      <w:proofErr w:type="spellEnd"/>
-      <w:r>
-        <w:t xml:space="preserve"> </w:t>
-      </w:r>
-      <w:proofErr w:type="spellStart"/>
-      <w:r>
-        <w:t>which</w:t>
+        <w:t xml:space="preserve">in</w:t>
+      </w:r>
+      <w:proofErr w:type="spellEnd"/>
+      <w:r>
+        <w:t xml:space="preserve"> </w:t>
+      </w:r>
+      <w:proofErr w:type="spellStart"/>
+      <w:r>
+        <w:t xml:space="preserve">which</w:t>
       </w:r>
       <w:proofErr w:type="spellEnd"/>
       <w:r>
@@ -1058,47 +1058,47 @@
       </w:r>
       <w:proofErr w:type="spellStart"/>
       <w:r>
-        <w:t>regional</w:t>
-      </w:r>
-      <w:proofErr w:type="spellEnd"/>
-      <w:r>
-        <w:t xml:space="preserve"> </w:t>
-      </w:r>
-      <w:proofErr w:type="spellStart"/>
-      <w:r>
-        <w:t>trade</w:t>
-      </w:r>
-      <w:proofErr w:type="spellEnd"/>
-      <w:r>
-        <w:t xml:space="preserve"> </w:t>
-      </w:r>
-      <w:proofErr w:type="spellStart"/>
-      <w:r>
-        <w:t>alliance</w:t>
-      </w:r>
-      <w:proofErr w:type="spellEnd"/>
-      <w:r>
-        <w:t xml:space="preserve"> </w:t>
-      </w:r>
-      <w:proofErr w:type="spellStart"/>
-      <w:r>
-        <w:t>does</w:t>
-      </w:r>
-      <w:proofErr w:type="spellEnd"/>
-      <w:r>
-        <w:t xml:space="preserve"> </w:t>
-      </w:r>
-      <w:proofErr w:type="spellStart"/>
-      <w:r>
-        <w:t>substantive</w:t>
-      </w:r>
-      <w:proofErr w:type="spellEnd"/>
-      <w:r>
-        <w:t xml:space="preserve"> </w:t>
-      </w:r>
-      <w:proofErr w:type="spellStart"/>
-      <w:r>
-        <w:t>work</w:t>
+        <w:t xml:space="preserve">regional</w:t>
+      </w:r>
+      <w:proofErr w:type="spellEnd"/>
+      <w:r>
+        <w:t xml:space="preserve"> </w:t>
+      </w:r>
+      <w:proofErr w:type="spellStart"/>
+      <w:r>
+        <w:t xml:space="preserve">trade</w:t>
+      </w:r>
+      <w:proofErr w:type="spellEnd"/>
+      <w:r>
+        <w:t xml:space="preserve"> </w:t>
+      </w:r>
+      <w:proofErr w:type="spellStart"/>
+      <w:r>
+        <w:t xml:space="preserve">alliance</w:t>
+      </w:r>
+      <w:proofErr w:type="spellEnd"/>
+      <w:r>
+        <w:t xml:space="preserve"> </w:t>
+      </w:r>
+      <w:proofErr w:type="spellStart"/>
+      <w:r>
+        <w:t xml:space="preserve">does</w:t>
+      </w:r>
+      <w:proofErr w:type="spellEnd"/>
+      <w:r>
+        <w:t xml:space="preserve"> </w:t>
+      </w:r>
+      <w:proofErr w:type="spellStart"/>
+      <w:r>
+        <w:t xml:space="preserve">substantive</w:t>
+      </w:r>
+      <w:proofErr w:type="spellEnd"/>
+      <w:r>
+        <w:t xml:space="preserve"> </w:t>
+      </w:r>
+      <w:proofErr w:type="spellStart"/>
+      <w:r>
+        <w:t xml:space="preserve">work</w:t>
       </w:r>
       <w:proofErr w:type="spellEnd"/>
       <w:r>
@@ -1106,111 +1106,111 @@
       </w:r>
       <w:proofErr w:type="spellStart"/>
       <w:r>
-        <w:t>Kazakhstan's</w:t>
-      </w:r>
-      <w:proofErr w:type="spellEnd"/>
-      <w:r>
-        <w:t xml:space="preserve"> </w:t>
-      </w:r>
-      <w:proofErr w:type="spellStart"/>
-      <w:r>
-        <w:t>customs</w:t>
-      </w:r>
-      <w:proofErr w:type="spellEnd"/>
-      <w:r>
-        <w:t xml:space="preserve"> </w:t>
-      </w:r>
-      <w:proofErr w:type="spellStart"/>
-      <w:r>
-        <w:t>union</w:t>
-      </w:r>
-      <w:proofErr w:type="spellEnd"/>
-      <w:r>
-        <w:t xml:space="preserve"> </w:t>
-      </w:r>
-      <w:proofErr w:type="spellStart"/>
-      <w:r>
-        <w:t>with</w:t>
-      </w:r>
-      <w:proofErr w:type="spellEnd"/>
-      <w:r>
-        <w:t xml:space="preserve"> </w:t>
-      </w:r>
-      <w:proofErr w:type="spellStart"/>
-      <w:r>
-        <w:t>the</w:t>
-      </w:r>
-      <w:proofErr w:type="spellEnd"/>
-      <w:r>
-        <w:t xml:space="preserve"> </w:t>
-      </w:r>
-      <w:proofErr w:type="spellStart"/>
-      <w:r>
-        <w:t>destination</w:t>
-      </w:r>
-      <w:proofErr w:type="spellEnd"/>
-      <w:r>
-        <w:t xml:space="preserve"> </w:t>
-      </w:r>
-      <w:proofErr w:type="spellStart"/>
-      <w:r>
-        <w:t>market</w:t>
-      </w:r>
-      <w:proofErr w:type="spellEnd"/>
-      <w:r>
-        <w:t xml:space="preserve"> </w:t>
-      </w:r>
-      <w:proofErr w:type="spellStart"/>
-      <w:r>
-        <w:t>is</w:t>
-      </w:r>
-      <w:proofErr w:type="spellEnd"/>
-      <w:r>
-        <w:t xml:space="preserve"> </w:t>
-      </w:r>
-      <w:proofErr w:type="spellStart"/>
-      <w:r>
-        <w:t>what</w:t>
-      </w:r>
-      <w:proofErr w:type="spellEnd"/>
-      <w:r>
-        <w:t xml:space="preserve"> </w:t>
-      </w:r>
-      <w:proofErr w:type="spellStart"/>
-      <w:r>
-        <w:t>keeps</w:t>
-      </w:r>
-      <w:proofErr w:type="spellEnd"/>
-      <w:r>
-        <w:t xml:space="preserve"> </w:t>
-      </w:r>
-      <w:proofErr w:type="spellStart"/>
-      <w:r>
-        <w:t>the</w:t>
-      </w:r>
-      <w:proofErr w:type="spellEnd"/>
-      <w:r>
-        <w:t xml:space="preserve"> </w:t>
-      </w:r>
-      <w:proofErr w:type="spellStart"/>
-      <w:r>
-        <w:t>market-access</w:t>
-      </w:r>
-      <w:proofErr w:type="spellEnd"/>
-      <w:r>
-        <w:t xml:space="preserve"> </w:t>
-      </w:r>
-      <w:proofErr w:type="spellStart"/>
-      <w:r>
-        <w:t>gate</w:t>
-      </w:r>
-      <w:proofErr w:type="spellEnd"/>
-      <w:r>
-        <w:t xml:space="preserve"> </w:t>
-      </w:r>
-      <w:proofErr w:type="spellStart"/>
-      <w:r>
-        <w:t>open</w:t>
+        <w:t xml:space="preserve">Kazakhstan's</w:t>
+      </w:r>
+      <w:proofErr w:type="spellEnd"/>
+      <w:r>
+        <w:t xml:space="preserve"> </w:t>
+      </w:r>
+      <w:proofErr w:type="spellStart"/>
+      <w:r>
+        <w:t xml:space="preserve">customs</w:t>
+      </w:r>
+      <w:proofErr w:type="spellEnd"/>
+      <w:r>
+        <w:t xml:space="preserve"> </w:t>
+      </w:r>
+      <w:proofErr w:type="spellStart"/>
+      <w:r>
+        <w:t xml:space="preserve">union</w:t>
+      </w:r>
+      <w:proofErr w:type="spellEnd"/>
+      <w:r>
+        <w:t xml:space="preserve"> </w:t>
+      </w:r>
+      <w:proofErr w:type="spellStart"/>
+      <w:r>
+        <w:t xml:space="preserve">with</w:t>
+      </w:r>
+      <w:proofErr w:type="spellEnd"/>
+      <w:r>
+        <w:t xml:space="preserve"> </w:t>
+      </w:r>
+      <w:proofErr w:type="spellStart"/>
+      <w:r>
+        <w:t xml:space="preserve">the</w:t>
+      </w:r>
+      <w:proofErr w:type="spellEnd"/>
+      <w:r>
+        <w:t xml:space="preserve"> </w:t>
+      </w:r>
+      <w:proofErr w:type="spellStart"/>
+      <w:r>
+        <w:t xml:space="preserve">destination</w:t>
+      </w:r>
+      <w:proofErr w:type="spellEnd"/>
+      <w:r>
+        <w:t xml:space="preserve"> </w:t>
+      </w:r>
+      <w:proofErr w:type="spellStart"/>
+      <w:r>
+        <w:t xml:space="preserve">market</w:t>
+      </w:r>
+      <w:proofErr w:type="spellEnd"/>
+      <w:r>
+        <w:t xml:space="preserve"> </w:t>
+      </w:r>
+      <w:proofErr w:type="spellStart"/>
+      <w:r>
+        <w:t xml:space="preserve">is</w:t>
+      </w:r>
+      <w:proofErr w:type="spellEnd"/>
+      <w:r>
+        <w:t xml:space="preserve"> </w:t>
+      </w:r>
+      <w:proofErr w:type="spellStart"/>
+      <w:r>
+        <w:t xml:space="preserve">what</w:t>
+      </w:r>
+      <w:proofErr w:type="spellEnd"/>
+      <w:r>
+        <w:t xml:space="preserve"> </w:t>
+      </w:r>
+      <w:proofErr w:type="spellStart"/>
+      <w:r>
+        <w:t xml:space="preserve">keeps</w:t>
+      </w:r>
+      <w:proofErr w:type="spellEnd"/>
+      <w:r>
+        <w:t xml:space="preserve"> </w:t>
+      </w:r>
+      <w:proofErr w:type="spellStart"/>
+      <w:r>
+        <w:t xml:space="preserve">the</w:t>
+      </w:r>
+      <w:proofErr w:type="spellEnd"/>
+      <w:r>
+        <w:t xml:space="preserve"> </w:t>
+      </w:r>
+      <w:proofErr w:type="spellStart"/>
+      <w:r>
+        <w:t xml:space="preserve">market-access</w:t>
+      </w:r>
+      <w:proofErr w:type="spellEnd"/>
+      <w:r>
+        <w:t xml:space="preserve"> </w:t>
+      </w:r>
+      <w:proofErr w:type="spellStart"/>
+      <w:r>
+        <w:t xml:space="preserve">gate</w:t>
+      </w:r>
+      <w:proofErr w:type="spellEnd"/>
+      <w:r>
+        <w:t xml:space="preserve"> </w:t>
+      </w:r>
+      <w:proofErr w:type="spellStart"/>
+      <w:r>
+        <w:t xml:space="preserve">open</w:t>
       </w:r>
       <w:proofErr w:type="spellEnd"/>
       <w:r>
@@ -1218,114 +1218,114 @@
       </w:r>
       <w:proofErr w:type="spellStart"/>
       <w:r>
-        <w:t>and</w:t>
-      </w:r>
-      <w:proofErr w:type="spellEnd"/>
-      <w:r>
-        <w:t xml:space="preserve"> </w:t>
-      </w:r>
-      <w:proofErr w:type="spellStart"/>
-      <w:r>
-        <w:t>it</w:t>
-      </w:r>
-      <w:proofErr w:type="spellEnd"/>
-      <w:r>
-        <w:t xml:space="preserve"> </w:t>
-      </w:r>
-      <w:proofErr w:type="spellStart"/>
-      <w:r>
-        <w:t>is</w:t>
-      </w:r>
-      <w:proofErr w:type="spellEnd"/>
-      <w:r>
-        <w:t xml:space="preserve"> </w:t>
-      </w:r>
-      <w:proofErr w:type="spellStart"/>
-      <w:r>
-        <w:t>this</w:t>
-      </w:r>
-      <w:proofErr w:type="spellEnd"/>
-      <w:r>
-        <w:t xml:space="preserve"> </w:t>
-      </w:r>
-      <w:proofErr w:type="spellStart"/>
-      <w:r>
-        <w:t>feature</w:t>
-      </w:r>
-      <w:proofErr w:type="spellEnd"/>
-      <w:r>
-        <w:t xml:space="preserve"> </w:t>
-      </w:r>
-      <w:proofErr w:type="spellStart"/>
-      <w:r>
-        <w:t>of</w:t>
-      </w:r>
-      <w:proofErr w:type="spellEnd"/>
-      <w:r>
-        <w:t xml:space="preserve"> </w:t>
-      </w:r>
-      <w:proofErr w:type="spellStart"/>
-      <w:r>
-        <w:t>the</w:t>
-      </w:r>
-      <w:proofErr w:type="spellEnd"/>
-      <w:r>
-        <w:t xml:space="preserve"> </w:t>
-      </w:r>
-      <w:proofErr w:type="spellStart"/>
-      <w:r>
-        <w:t>regional</w:t>
-      </w:r>
-      <w:proofErr w:type="spellEnd"/>
-      <w:r>
-        <w:t xml:space="preserve"> </w:t>
-      </w:r>
-      <w:proofErr w:type="spellStart"/>
-      <w:r>
-        <w:t>arrangement</w:t>
-      </w:r>
-      <w:proofErr w:type="spellEnd"/>
-      <w:r>
-        <w:t>,</w:t>
-      </w:r>
-      <w:r>
-        <w:t xml:space="preserve"> </w:t>
-      </w:r>
-      <w:proofErr w:type="spellStart"/>
-      <w:r>
-        <w:t>not</w:t>
-      </w:r>
-      <w:proofErr w:type="spellEnd"/>
-      <w:r>
-        <w:t xml:space="preserve"> </w:t>
-      </w:r>
-      <w:proofErr w:type="spellStart"/>
-      <w:r>
-        <w:t>only</w:t>
-      </w:r>
-      <w:proofErr w:type="spellEnd"/>
-      <w:r>
-        <w:t xml:space="preserve"> </w:t>
-      </w:r>
-      <w:proofErr w:type="spellStart"/>
-      <w:r>
-        <w:t>the</w:t>
-      </w:r>
-      <w:proofErr w:type="spellEnd"/>
-      <w:r>
-        <w:t xml:space="preserve"> </w:t>
-      </w:r>
-      <w:proofErr w:type="spellStart"/>
-      <w:r>
-        <w:t>shock's</w:t>
-      </w:r>
-      <w:proofErr w:type="spellEnd"/>
-      <w:r>
-        <w:t xml:space="preserve"> </w:t>
-      </w:r>
-      <w:proofErr w:type="spellStart"/>
-      <w:r>
-        <w:t>size</w:t>
+        <w:t xml:space="preserve">and</w:t>
+      </w:r>
+      <w:proofErr w:type="spellEnd"/>
+      <w:r>
+        <w:t xml:space="preserve"> </w:t>
+      </w:r>
+      <w:proofErr w:type="spellStart"/>
+      <w:r>
+        <w:t xml:space="preserve">it</w:t>
+      </w:r>
+      <w:proofErr w:type="spellEnd"/>
+      <w:r>
+        <w:t xml:space="preserve"> </w:t>
+      </w:r>
+      <w:proofErr w:type="spellStart"/>
+      <w:r>
+        <w:t xml:space="preserve">is</w:t>
+      </w:r>
+      <w:proofErr w:type="spellEnd"/>
+      <w:r>
+        <w:t xml:space="preserve"> </w:t>
+      </w:r>
+      <w:proofErr w:type="spellStart"/>
+      <w:r>
+        <w:t xml:space="preserve">this</w:t>
+      </w:r>
+      <w:proofErr w:type="spellEnd"/>
+      <w:r>
+        <w:t xml:space="preserve"> </w:t>
+      </w:r>
+      <w:proofErr w:type="spellStart"/>
+      <w:r>
+        <w:t xml:space="preserve">feature</w:t>
+      </w:r>
+      <w:proofErr w:type="spellEnd"/>
+      <w:r>
+        <w:t xml:space="preserve"> </w:t>
+      </w:r>
+      <w:proofErr w:type="spellStart"/>
+      <w:r>
+        <w:t xml:space="preserve">of</w:t>
+      </w:r>
+      <w:proofErr w:type="spellEnd"/>
+      <w:r>
+        <w:t xml:space="preserve"> </w:t>
+      </w:r>
+      <w:proofErr w:type="spellStart"/>
+      <w:r>
+        <w:t xml:space="preserve">the</w:t>
+      </w:r>
+      <w:proofErr w:type="spellEnd"/>
+      <w:r>
+        <w:t xml:space="preserve"> </w:t>
+      </w:r>
+      <w:proofErr w:type="spellStart"/>
+      <w:r>
+        <w:t xml:space="preserve">regional</w:t>
+      </w:r>
+      <w:proofErr w:type="spellEnd"/>
+      <w:r>
+        <w:t xml:space="preserve"> </w:t>
+      </w:r>
+      <w:proofErr w:type="spellStart"/>
+      <w:r>
+        <w:t xml:space="preserve">arrangement</w:t>
+      </w:r>
+      <w:proofErr w:type="spellEnd"/>
+      <w:r>
+        <w:t xml:space="preserve">,</w:t>
+      </w:r>
+      <w:r>
+        <w:t xml:space="preserve"> </w:t>
+      </w:r>
+      <w:proofErr w:type="spellStart"/>
+      <w:r>
+        <w:t xml:space="preserve">not</w:t>
+      </w:r>
+      <w:proofErr w:type="spellEnd"/>
+      <w:r>
+        <w:t xml:space="preserve"> </w:t>
+      </w:r>
+      <w:proofErr w:type="spellStart"/>
+      <w:r>
+        <w:t xml:space="preserve">only</w:t>
+      </w:r>
+      <w:proofErr w:type="spellEnd"/>
+      <w:r>
+        <w:t xml:space="preserve"> </w:t>
+      </w:r>
+      <w:proofErr w:type="spellStart"/>
+      <w:r>
+        <w:t xml:space="preserve">the</w:t>
+      </w:r>
+      <w:proofErr w:type="spellEnd"/>
+      <w:r>
+        <w:t xml:space="preserve"> </w:t>
+      </w:r>
+      <w:proofErr w:type="spellStart"/>
+      <w:r>
+        <w:t xml:space="preserve">shock's</w:t>
+      </w:r>
+      <w:proofErr w:type="spellEnd"/>
+      <w:r>
+        <w:t xml:space="preserve"> </w:t>
+      </w:r>
+      <w:proofErr w:type="spellStart"/>
+      <w:r>
+        <w:t xml:space="preserve">size</w:t>
       </w:r>
       <w:proofErr w:type="spellEnd"/>
       <w:r>
@@ -1333,87 +1333,87 @@
       </w:r>
       <w:proofErr w:type="spellStart"/>
       <w:r>
-        <w:t>that</w:t>
-      </w:r>
-      <w:proofErr w:type="spellEnd"/>
-      <w:r>
-        <w:t xml:space="preserve"> </w:t>
-      </w:r>
-      <w:proofErr w:type="spellStart"/>
-      <w:r>
-        <w:t>the</w:t>
-      </w:r>
-      <w:proofErr w:type="spellEnd"/>
-      <w:r>
-        <w:t xml:space="preserve"> </w:t>
-      </w:r>
-      <w:proofErr w:type="spellStart"/>
-      <w:r>
-        <w:t>framework</w:t>
-      </w:r>
-      <w:proofErr w:type="spellEnd"/>
-      <w:r>
-        <w:t xml:space="preserve"> </w:t>
-      </w:r>
-      <w:proofErr w:type="spellStart"/>
-      <w:r>
-        <w:t>identifies</w:t>
-      </w:r>
-      <w:proofErr w:type="spellEnd"/>
-      <w:r>
-        <w:t xml:space="preserve"> </w:t>
-      </w:r>
-      <w:proofErr w:type="spellStart"/>
-      <w:r>
-        <w:t>as</w:t>
-      </w:r>
-      <w:proofErr w:type="spellEnd"/>
-      <w:r>
-        <w:t xml:space="preserve"> </w:t>
-      </w:r>
-      <w:proofErr w:type="spellStart"/>
-      <w:r>
-        <w:t>central</w:t>
-      </w:r>
-      <w:proofErr w:type="spellEnd"/>
-      <w:r>
-        <w:t xml:space="preserve"> </w:t>
-      </w:r>
-      <w:proofErr w:type="spellStart"/>
-      <w:r>
-        <w:t>to</w:t>
-      </w:r>
-      <w:proofErr w:type="spellEnd"/>
-      <w:r>
-        <w:t xml:space="preserve"> </w:t>
-      </w:r>
-      <w:proofErr w:type="spellStart"/>
-      <w:r>
-        <w:t>the</w:t>
-      </w:r>
-      <w:proofErr w:type="spellEnd"/>
-      <w:r>
-        <w:t xml:space="preserve"> </w:t>
-      </w:r>
-      <w:proofErr w:type="spellStart"/>
-      <w:r>
-        <w:t>missing</w:t>
-      </w:r>
-      <w:proofErr w:type="spellEnd"/>
-      <w:r>
-        <w:t xml:space="preserve"> </w:t>
-      </w:r>
-      <w:proofErr w:type="spellStart"/>
-      <w:r>
-        <w:t>supply</w:t>
-      </w:r>
-      <w:proofErr w:type="spellEnd"/>
-      <w:r>
-        <w:t xml:space="preserve"> </w:t>
-      </w:r>
-      <w:proofErr w:type="spellStart"/>
-      <w:r>
-        <w:t>response</w:t>
+        <w:t xml:space="preserve">that</w:t>
+      </w:r>
+      <w:proofErr w:type="spellEnd"/>
+      <w:r>
+        <w:t xml:space="preserve"> </w:t>
+      </w:r>
+      <w:proofErr w:type="spellStart"/>
+      <w:r>
+        <w:t xml:space="preserve">the</w:t>
+      </w:r>
+      <w:proofErr w:type="spellEnd"/>
+      <w:r>
+        <w:t xml:space="preserve"> </w:t>
+      </w:r>
+      <w:proofErr w:type="spellStart"/>
+      <w:r>
+        <w:t xml:space="preserve">framework</w:t>
+      </w:r>
+      <w:proofErr w:type="spellEnd"/>
+      <w:r>
+        <w:t xml:space="preserve"> </w:t>
+      </w:r>
+      <w:proofErr w:type="spellStart"/>
+      <w:r>
+        <w:t xml:space="preserve">identifies</w:t>
+      </w:r>
+      <w:proofErr w:type="spellEnd"/>
+      <w:r>
+        <w:t xml:space="preserve"> </w:t>
+      </w:r>
+      <w:proofErr w:type="spellStart"/>
+      <w:r>
+        <w:t xml:space="preserve">as</w:t>
+      </w:r>
+      <w:proofErr w:type="spellEnd"/>
+      <w:r>
+        <w:t xml:space="preserve"> </w:t>
+      </w:r>
+      <w:proofErr w:type="spellStart"/>
+      <w:r>
+        <w:t xml:space="preserve">central</w:t>
+      </w:r>
+      <w:proofErr w:type="spellEnd"/>
+      <w:r>
+        <w:t xml:space="preserve"> </w:t>
+      </w:r>
+      <w:proofErr w:type="spellStart"/>
+      <w:r>
+        <w:t xml:space="preserve">to</w:t>
+      </w:r>
+      <w:proofErr w:type="spellEnd"/>
+      <w:r>
+        <w:t xml:space="preserve"> </w:t>
+      </w:r>
+      <w:proofErr w:type="spellStart"/>
+      <w:r>
+        <w:t xml:space="preserve">the</w:t>
+      </w:r>
+      <w:proofErr w:type="spellEnd"/>
+      <w:r>
+        <w:t xml:space="preserve"> </w:t>
+      </w:r>
+      <w:proofErr w:type="spellStart"/>
+      <w:r>
+        <w:t xml:space="preserve">missing</w:t>
+      </w:r>
+      <w:proofErr w:type="spellEnd"/>
+      <w:r>
+        <w:t xml:space="preserve"> </w:t>
+      </w:r>
+      <w:proofErr w:type="spellStart"/>
+      <w:r>
+        <w:t xml:space="preserve">supply</w:t>
+      </w:r>
+      <w:proofErr w:type="spellEnd"/>
+      <w:r>
+        <w:t xml:space="preserve"> </w:t>
+      </w:r>
+      <w:proofErr w:type="spellStart"/>
+      <w:r>
+        <w:t xml:space="preserve">response</w:t>
       </w:r>
       <w:proofErr w:type="spellEnd"/>
       <w:r>
@@ -1421,23 +1421,23 @@
       </w:r>
       <w:proofErr w:type="spellStart"/>
       <w:r>
-        <w:t>paper</w:t>
-      </w:r>
-      <w:proofErr w:type="spellEnd"/>
-      <w:r>
-        <w:t xml:space="preserve"> </w:t>
-      </w:r>
-      <w:proofErr w:type="spellStart"/>
-      <w:r>
-        <w:t>is</w:t>
-      </w:r>
-      <w:proofErr w:type="spellEnd"/>
-      <w:r>
-        <w:t xml:space="preserve"> </w:t>
-      </w:r>
-      <w:proofErr w:type="spellStart"/>
-      <w:r>
-        <w:t>accordingly</w:t>
+        <w:t xml:space="preserve">paper</w:t>
+      </w:r>
+      <w:proofErr w:type="spellEnd"/>
+      <w:r>
+        <w:t xml:space="preserve"> </w:t>
+      </w:r>
+      <w:proofErr w:type="spellStart"/>
+      <w:r>
+        <w:t xml:space="preserve">is</w:t>
+      </w:r>
+      <w:proofErr w:type="spellEnd"/>
+      <w:r>
+        <w:t xml:space="preserve"> </w:t>
+      </w:r>
+      <w:proofErr w:type="spellStart"/>
+      <w:r>
+        <w:t xml:space="preserve">accordingly</w:t>
       </w:r>
       <w:proofErr w:type="spellEnd"/>
       <w:r>
@@ -1445,119 +1445,119 @@
       </w:r>
       <w:proofErr w:type="spellStart"/>
       <w:r>
-        <w:t>direct</w:t>
-      </w:r>
-      <w:proofErr w:type="spellEnd"/>
-      <w:r>
-        <w:t xml:space="preserve"> </w:t>
-      </w:r>
-      <w:proofErr w:type="spellStart"/>
-      <w:r>
-        <w:t>empirical</w:t>
-      </w:r>
-      <w:proofErr w:type="spellEnd"/>
-      <w:r>
-        <w:t xml:space="preserve"> </w:t>
-      </w:r>
-      <w:proofErr w:type="spellStart"/>
-      <w:r>
-        <w:t>instance</w:t>
-      </w:r>
-      <w:proofErr w:type="spellEnd"/>
-      <w:r>
-        <w:t xml:space="preserve"> </w:t>
-      </w:r>
-      <w:proofErr w:type="spellStart"/>
-      <w:r>
-        <w:t>of</w:t>
-      </w:r>
-      <w:proofErr w:type="spellEnd"/>
-      <w:r>
-        <w:t xml:space="preserve"> </w:t>
-      </w:r>
-      <w:proofErr w:type="spellStart"/>
-      <w:r>
-        <w:t>how</w:t>
-      </w:r>
-      <w:proofErr w:type="spellEnd"/>
-      <w:r>
-        <w:t xml:space="preserve"> </w:t>
-      </w:r>
-      <w:proofErr w:type="spellStart"/>
-      <w:r>
-        <w:t>regional</w:t>
-      </w:r>
-      <w:proofErr w:type="spellEnd"/>
-      <w:r>
-        <w:t xml:space="preserve"> </w:t>
-      </w:r>
-      <w:proofErr w:type="spellStart"/>
-      <w:r>
-        <w:t>trade</w:t>
-      </w:r>
-      <w:proofErr w:type="spellEnd"/>
-      <w:r>
-        <w:t xml:space="preserve"> </w:t>
-      </w:r>
-      <w:proofErr w:type="spellStart"/>
-      <w:r>
-        <w:t>alliances</w:t>
-      </w:r>
-      <w:proofErr w:type="spellEnd"/>
-      <w:r>
-        <w:t xml:space="preserve"> </w:t>
-      </w:r>
-      <w:proofErr w:type="spellStart"/>
-      <w:r>
-        <w:t>shape</w:t>
-      </w:r>
-      <w:proofErr w:type="spellEnd"/>
-      <w:r>
-        <w:t xml:space="preserve"> </w:t>
-      </w:r>
-      <w:proofErr w:type="spellStart"/>
-      <w:r>
-        <w:t>the</w:t>
-      </w:r>
-      <w:proofErr w:type="spellEnd"/>
-      <w:r>
-        <w:t xml:space="preserve"> </w:t>
-      </w:r>
-      <w:proofErr w:type="spellStart"/>
-      <w:r>
-        <w:t>domestic</w:t>
-      </w:r>
-      <w:proofErr w:type="spellEnd"/>
-      <w:r>
-        <w:t xml:space="preserve"> </w:t>
-      </w:r>
-      <w:proofErr w:type="spellStart"/>
-      <w:r>
-        <w:t>consequences</w:t>
-      </w:r>
-      <w:proofErr w:type="spellEnd"/>
-      <w:r>
-        <w:t xml:space="preserve"> </w:t>
-      </w:r>
-      <w:proofErr w:type="spellStart"/>
-      <w:r>
-        <w:t>of</w:t>
-      </w:r>
-      <w:proofErr w:type="spellEnd"/>
-      <w:r>
-        <w:t xml:space="preserve"> </w:t>
-      </w:r>
-      <w:proofErr w:type="spellStart"/>
-      <w:r>
-        <w:t>geoeconomic</w:t>
-      </w:r>
-      <w:proofErr w:type="spellEnd"/>
-      <w:r>
-        <w:t xml:space="preserve"> </w:t>
-      </w:r>
-      <w:proofErr w:type="spellStart"/>
-      <w:r>
-        <w:t>fragmentation</w:t>
+        <w:t xml:space="preserve">direct</w:t>
+      </w:r>
+      <w:proofErr w:type="spellEnd"/>
+      <w:r>
+        <w:t xml:space="preserve"> </w:t>
+      </w:r>
+      <w:proofErr w:type="spellStart"/>
+      <w:r>
+        <w:t xml:space="preserve">empirical</w:t>
+      </w:r>
+      <w:proofErr w:type="spellEnd"/>
+      <w:r>
+        <w:t xml:space="preserve"> </w:t>
+      </w:r>
+      <w:proofErr w:type="spellStart"/>
+      <w:r>
+        <w:t xml:space="preserve">instance</w:t>
+      </w:r>
+      <w:proofErr w:type="spellEnd"/>
+      <w:r>
+        <w:t xml:space="preserve"> </w:t>
+      </w:r>
+      <w:proofErr w:type="spellStart"/>
+      <w:r>
+        <w:t xml:space="preserve">of</w:t>
+      </w:r>
+      <w:proofErr w:type="spellEnd"/>
+      <w:r>
+        <w:t xml:space="preserve"> </w:t>
+      </w:r>
+      <w:proofErr w:type="spellStart"/>
+      <w:r>
+        <w:t xml:space="preserve">how</w:t>
+      </w:r>
+      <w:proofErr w:type="spellEnd"/>
+      <w:r>
+        <w:t xml:space="preserve"> </w:t>
+      </w:r>
+      <w:proofErr w:type="spellStart"/>
+      <w:r>
+        <w:t xml:space="preserve">regional</w:t>
+      </w:r>
+      <w:proofErr w:type="spellEnd"/>
+      <w:r>
+        <w:t xml:space="preserve"> </w:t>
+      </w:r>
+      <w:proofErr w:type="spellStart"/>
+      <w:r>
+        <w:t xml:space="preserve">trade</w:t>
+      </w:r>
+      <w:proofErr w:type="spellEnd"/>
+      <w:r>
+        <w:t xml:space="preserve"> </w:t>
+      </w:r>
+      <w:proofErr w:type="spellStart"/>
+      <w:r>
+        <w:t xml:space="preserve">alliances</w:t>
+      </w:r>
+      <w:proofErr w:type="spellEnd"/>
+      <w:r>
+        <w:t xml:space="preserve"> </w:t>
+      </w:r>
+      <w:proofErr w:type="spellStart"/>
+      <w:r>
+        <w:t xml:space="preserve">shape</w:t>
+      </w:r>
+      <w:proofErr w:type="spellEnd"/>
+      <w:r>
+        <w:t xml:space="preserve"> </w:t>
+      </w:r>
+      <w:proofErr w:type="spellStart"/>
+      <w:r>
+        <w:t xml:space="preserve">the</w:t>
+      </w:r>
+      <w:proofErr w:type="spellEnd"/>
+      <w:r>
+        <w:t xml:space="preserve"> </w:t>
+      </w:r>
+      <w:proofErr w:type="spellStart"/>
+      <w:r>
+        <w:t xml:space="preserve">domestic</w:t>
+      </w:r>
+      <w:proofErr w:type="spellEnd"/>
+      <w:r>
+        <w:t xml:space="preserve"> </w:t>
+      </w:r>
+      <w:proofErr w:type="spellStart"/>
+      <w:r>
+        <w:t xml:space="preserve">consequences</w:t>
+      </w:r>
+      <w:proofErr w:type="spellEnd"/>
+      <w:r>
+        <w:t xml:space="preserve"> </w:t>
+      </w:r>
+      <w:proofErr w:type="spellStart"/>
+      <w:r>
+        <w:t xml:space="preserve">of</w:t>
+      </w:r>
+      <w:proofErr w:type="spellEnd"/>
+      <w:r>
+        <w:t xml:space="preserve"> </w:t>
+      </w:r>
+      <w:proofErr w:type="spellStart"/>
+      <w:r>
+        <w:t xml:space="preserve">geoeconomic</w:t>
+      </w:r>
+      <w:proofErr w:type="spellEnd"/>
+      <w:r>
+        <w:t xml:space="preserve"> </w:t>
+      </w:r>
+      <w:proofErr w:type="spellStart"/>
+      <w:r>
+        <w:t xml:space="preserve">fragmentation</w:t>
       </w:r>
       <w:proofErr w:type="spellEnd"/>
       <w:r>
@@ -1565,63 +1565,63 @@
       </w:r>
       <w:proofErr w:type="spellStart"/>
       <w:r>
-        <w:t>one</w:t>
-      </w:r>
-      <w:proofErr w:type="spellEnd"/>
-      <w:r>
-        <w:t xml:space="preserve"> </w:t>
-      </w:r>
-      <w:proofErr w:type="spellStart"/>
-      <w:r>
-        <w:t>of</w:t>
-      </w:r>
-      <w:proofErr w:type="spellEnd"/>
-      <w:r>
-        <w:t xml:space="preserve"> </w:t>
-      </w:r>
-      <w:proofErr w:type="spellStart"/>
-      <w:r>
-        <w:t>the</w:t>
-      </w:r>
-      <w:proofErr w:type="spellEnd"/>
-      <w:r>
-        <w:t xml:space="preserve"> </w:t>
-      </w:r>
-      <w:proofErr w:type="spellStart"/>
-      <w:r>
-        <w:t>special</w:t>
-      </w:r>
-      <w:proofErr w:type="spellEnd"/>
-      <w:r>
-        <w:t xml:space="preserve"> </w:t>
-      </w:r>
-      <w:proofErr w:type="spellStart"/>
-      <w:r>
-        <w:t>issue's</w:t>
-      </w:r>
-      <w:proofErr w:type="spellEnd"/>
-      <w:r>
-        <w:t xml:space="preserve"> </w:t>
-      </w:r>
-      <w:proofErr w:type="spellStart"/>
-      <w:r>
-        <w:t>explicitly</w:t>
-      </w:r>
-      <w:proofErr w:type="spellEnd"/>
-      <w:r>
-        <w:t xml:space="preserve"> </w:t>
-      </w:r>
-      <w:proofErr w:type="spellStart"/>
-      <w:r>
-        <w:t>stated</w:t>
-      </w:r>
-      <w:proofErr w:type="spellEnd"/>
-      <w:r>
-        <w:t xml:space="preserve"> </w:t>
-      </w:r>
-      <w:proofErr w:type="spellStart"/>
-      <w:r>
-        <w:t>themes</w:t>
+        <w:t xml:space="preserve">one</w:t>
+      </w:r>
+      <w:proofErr w:type="spellEnd"/>
+      <w:r>
+        <w:t xml:space="preserve"> </w:t>
+      </w:r>
+      <w:proofErr w:type="spellStart"/>
+      <w:r>
+        <w:t xml:space="preserve">of</w:t>
+      </w:r>
+      <w:proofErr w:type="spellEnd"/>
+      <w:r>
+        <w:t xml:space="preserve"> </w:t>
+      </w:r>
+      <w:proofErr w:type="spellStart"/>
+      <w:r>
+        <w:t xml:space="preserve">the</w:t>
+      </w:r>
+      <w:proofErr w:type="spellEnd"/>
+      <w:r>
+        <w:t xml:space="preserve"> </w:t>
+      </w:r>
+      <w:proofErr w:type="spellStart"/>
+      <w:r>
+        <w:t xml:space="preserve">special</w:t>
+      </w:r>
+      <w:proofErr w:type="spellEnd"/>
+      <w:r>
+        <w:t xml:space="preserve"> </w:t>
+      </w:r>
+      <w:proofErr w:type="spellStart"/>
+      <w:r>
+        <w:t xml:space="preserve">issue's</w:t>
+      </w:r>
+      <w:proofErr w:type="spellEnd"/>
+      <w:r>
+        <w:t xml:space="preserve"> </w:t>
+      </w:r>
+      <w:proofErr w:type="spellStart"/>
+      <w:r>
+        <w:t xml:space="preserve">explicitly</w:t>
+      </w:r>
+      <w:proofErr w:type="spellEnd"/>
+      <w:r>
+        <w:t xml:space="preserve"> </w:t>
+      </w:r>
+      <w:proofErr w:type="spellStart"/>
+      <w:r>
+        <w:t xml:space="preserve">stated</w:t>
+      </w:r>
+      <w:proofErr w:type="spellEnd"/>
+      <w:r>
+        <w:t xml:space="preserve"> </w:t>
+      </w:r>
+      <w:proofErr w:type="spellStart"/>
+      <w:r>
+        <w:t xml:space="preserve">themes</w:t>
       </w:r>
       <w:proofErr w:type="spellEnd"/>
       <w:r>
@@ -1629,67 +1629,67 @@
       </w:r>
       <w:proofErr w:type="spellStart"/>
       <w:r>
-        <w:t>alongside</w:t>
-      </w:r>
-      <w:proofErr w:type="spellEnd"/>
-      <w:r>
-        <w:t xml:space="preserve"> </w:t>
-      </w:r>
-      <w:proofErr w:type="spellStart"/>
-      <w:r>
-        <w:t>sanctions</w:t>
-      </w:r>
-      <w:proofErr w:type="spellEnd"/>
-      <w:r>
-        <w:t xml:space="preserve">, </w:t>
-      </w:r>
-      <w:proofErr w:type="spellStart"/>
-      <w:r>
-        <w:t>supply-chain</w:t>
-      </w:r>
-      <w:proofErr w:type="spellEnd"/>
-      <w:r>
-        <w:t xml:space="preserve"> </w:t>
-      </w:r>
-      <w:proofErr w:type="spellStart"/>
-      <w:r>
-        <w:t>reconfiguration</w:t>
-      </w:r>
-      <w:proofErr w:type="spellEnd"/>
-      <w:r>
-        <w:t xml:space="preserve">, </w:t>
-      </w:r>
-      <w:proofErr w:type="spellStart"/>
-      <w:r>
-        <w:t>and</w:t>
-      </w:r>
-      <w:proofErr w:type="spellEnd"/>
-      <w:r>
-        <w:t xml:space="preserve"> </w:t>
-      </w:r>
-      <w:proofErr w:type="spellStart"/>
-      <w:r>
-        <w:t>firm-level</w:t>
-      </w:r>
-      <w:proofErr w:type="spellEnd"/>
-      <w:r>
-        <w:t xml:space="preserve"> </w:t>
-      </w:r>
-      <w:proofErr w:type="spellStart"/>
-      <w:r>
-        <w:t>investment</w:t>
-      </w:r>
-      <w:proofErr w:type="spellEnd"/>
-      <w:r>
-        <w:t xml:space="preserve"> </w:t>
-      </w:r>
-      <w:proofErr w:type="spellStart"/>
-      <w:r>
-        <w:t>responses</w:t>
-      </w:r>
-      <w:proofErr w:type="spellEnd"/>
-      <w:r>
-        <w:t>.</w:t>
+        <w:t xml:space="preserve">alongside supply-chain reconfiguration,</w:t>
+      </w:r>
+      <w:proofErr w:type="spellEnd"/>
+      <w:r>
+        <w:t xml:space="preserve"/>
+      </w:r>
+      <w:proofErr w:type="spellStart"/>
+      <w:r>
+        <w:t xml:space="preserve"/>
+      </w:r>
+      <w:proofErr w:type="spellEnd"/>
+      <w:r>
+        <w:t xml:space="preserve"/>
+      </w:r>
+      <w:proofErr w:type="spellStart"/>
+      <w:r>
+        <w:t xml:space="preserve"/>
+      </w:r>
+      <w:proofErr w:type="spellEnd"/>
+      <w:r>
+        <w:t xml:space="preserve"/>
+      </w:r>
+      <w:proofErr w:type="spellStart"/>
+      <w:r>
+        <w:t xml:space="preserve"/>
+      </w:r>
+      <w:proofErr w:type="spellEnd"/>
+      <w:r>
+        <w:t xml:space="preserve"> </w:t>
+      </w:r>
+      <w:proofErr w:type="spellStart"/>
+      <w:r>
+        <w:t xml:space="preserve">and</w:t>
+      </w:r>
+      <w:proofErr w:type="spellEnd"/>
+      <w:r>
+        <w:t xml:space="preserve"> </w:t>
+      </w:r>
+      <w:proofErr w:type="spellStart"/>
+      <w:r>
+        <w:t xml:space="preserve">firm-level</w:t>
+      </w:r>
+      <w:proofErr w:type="spellEnd"/>
+      <w:r>
+        <w:t xml:space="preserve"> </w:t>
+      </w:r>
+      <w:proofErr w:type="spellStart"/>
+      <w:r>
+        <w:t xml:space="preserve">investment</w:t>
+      </w:r>
+      <w:proofErr w:type="spellEnd"/>
+      <w:r>
+        <w:t xml:space="preserve"> </w:t>
+      </w:r>
+      <w:proofErr w:type="spellStart"/>
+      <w:r>
+        <w:t xml:space="preserve">responses</w:t>
+      </w:r>
+      <w:proofErr w:type="spellEnd"/>
+      <w:r>
+        <w:t xml:space="preserve">.</w:t>
       </w:r>
     </w:p>
     <w:p>

</xml_diff>